<commit_message>
python assignment answers removed and finished up to 05
</commit_message>
<xml_diff>
--- a/Python/Python_Assignments.docx
+++ b/Python/Python_Assignments.docx
@@ -1398,7 +1398,15 @@
           <w:sz w:val="40"/>
           <w:szCs w:val="48"/>
         </w:rPr>
-        <w:t>OnOff</w:t>
+        <w:t>o</w:t>
+      </w:r>
+      <w:r>
+        <w:rPr>
+          <w:b/>
+          <w:sz w:val="40"/>
+          <w:szCs w:val="48"/>
+        </w:rPr>
+        <w:t>nOff</w:t>
       </w:r>
     </w:p>
     <w:p>
@@ -2102,308 +2110,444 @@
         </w:rPr>
         <w:t>Assignment 05</w:t>
       </w:r>
+      <w:r>
+        <w:rPr>
+          <w:b/>
+          <w:sz w:val="40"/>
+          <w:szCs w:val="48"/>
+        </w:rPr>
+        <w:t>colors</w:t>
+      </w:r>
+    </w:p>
+    <w:p>
+      <w:pPr>
+        <w:rPr>
+          <w:sz w:val="28"/>
+          <w:szCs w:val="48"/>
+        </w:rPr>
+      </w:pPr>
+      <w:r>
+        <w:rPr>
+          <w:sz w:val="28"/>
+          <w:szCs w:val="48"/>
+        </w:rPr>
+        <w:tab/>
+        <w:t>Okay, that la</w:t>
+      </w:r>
+      <w:r>
+        <w:rPr>
+          <w:sz w:val="28"/>
+          <w:szCs w:val="48"/>
+        </w:rPr>
+        <w:t>st assignment was about as gross</w:t>
+      </w:r>
+      <w:r>
+        <w:rPr>
+          <w:sz w:val="28"/>
+          <w:szCs w:val="48"/>
+        </w:rPr>
+        <w:t xml:space="preserve"> as they get.  </w:t>
+      </w:r>
+      <w:r>
+        <w:rPr>
+          <w:sz w:val="28"/>
+          <w:szCs w:val="48"/>
+        </w:rPr>
+        <w:t xml:space="preserve">We’re </w:t>
+      </w:r>
+      <w:proofErr w:type="spellStart"/>
+      <w:r>
+        <w:rPr>
+          <w:sz w:val="28"/>
+          <w:szCs w:val="48"/>
+        </w:rPr>
+        <w:t>gonna</w:t>
+      </w:r>
+      <w:proofErr w:type="spellEnd"/>
+      <w:r>
+        <w:rPr>
+          <w:sz w:val="28"/>
+          <w:szCs w:val="48"/>
+        </w:rPr>
+        <w:t xml:space="preserve"> take a step back now on this next assignment.</w:t>
+      </w:r>
+      <w:r>
+        <w:rPr>
+          <w:sz w:val="28"/>
+          <w:szCs w:val="48"/>
+        </w:rPr>
+        <w:t xml:space="preserve">  We’re moving on from controlling a single led, to controlling three of them!  In lab, we’ll actually be using Tricolor LEDs, which contain three separate </w:t>
+      </w:r>
+      <w:proofErr w:type="spellStart"/>
+      <w:r>
+        <w:rPr>
+          <w:sz w:val="28"/>
+          <w:szCs w:val="48"/>
+        </w:rPr>
+        <w:t>leds</w:t>
+      </w:r>
+      <w:proofErr w:type="spellEnd"/>
+      <w:r>
+        <w:rPr>
+          <w:sz w:val="28"/>
+          <w:szCs w:val="48"/>
+        </w:rPr>
+        <w:t xml:space="preserve"> in a single unit/package.</w:t>
+      </w:r>
+    </w:p>
+    <w:p>
+      <w:pPr>
+        <w:rPr>
+          <w:sz w:val="28"/>
+          <w:szCs w:val="48"/>
+        </w:rPr>
+      </w:pPr>
+      <w:r>
+        <w:rPr>
+          <w:sz w:val="28"/>
+          <w:szCs w:val="48"/>
+        </w:rPr>
+        <w:tab/>
+      </w:r>
+      <w:r>
+        <w:rPr>
+          <w:sz w:val="28"/>
+          <w:szCs w:val="48"/>
+        </w:rPr>
+        <w:t>The goal of this code is to be able to control separate colors individually, and to transition between them with a trigger</w:t>
+      </w:r>
+      <w:r>
+        <w:rPr>
+          <w:sz w:val="28"/>
+          <w:szCs w:val="48"/>
+        </w:rPr>
+        <w:t xml:space="preserve"> (we’ll say if a “1” is entered it transitions)</w:t>
+      </w:r>
+      <w:r>
+        <w:rPr>
+          <w:sz w:val="28"/>
+          <w:szCs w:val="48"/>
+        </w:rPr>
+        <w:t>.  We’ll have to introduce arrays to get this to work, and an index to move through</w:t>
+      </w:r>
+      <w:r>
+        <w:rPr>
+          <w:sz w:val="28"/>
+          <w:szCs w:val="48"/>
+        </w:rPr>
+        <w:t xml:space="preserve"> the colors and track which one is on</w:t>
+      </w:r>
+      <w:r>
+        <w:rPr>
+          <w:sz w:val="28"/>
+          <w:szCs w:val="48"/>
+        </w:rPr>
+        <w:t>.</w:t>
+      </w:r>
+    </w:p>
+    <w:p>
+      <w:pPr>
+        <w:rPr>
+          <w:sz w:val="28"/>
+          <w:szCs w:val="48"/>
+        </w:rPr>
+      </w:pPr>
+      <w:r>
+        <w:rPr>
+          <w:sz w:val="28"/>
+          <w:szCs w:val="48"/>
+        </w:rPr>
+        <w:tab/>
+        <w:t xml:space="preserve">There is a skeleton again, </w:t>
+      </w:r>
+      <w:r>
+        <w:rPr>
+          <w:sz w:val="28"/>
+          <w:szCs w:val="48"/>
+        </w:rPr>
+        <w:t xml:space="preserve">but because we’re using a tricolor LED, virtual </w:t>
+      </w:r>
+      <w:r>
+        <w:rPr>
+          <w:sz w:val="28"/>
+          <w:szCs w:val="48"/>
+        </w:rPr>
+        <w:t xml:space="preserve">doesn’t do a great job of describing the situation, so we’re using </w:t>
+      </w:r>
+      <w:proofErr w:type="spellStart"/>
+      <w:r>
+        <w:rPr>
+          <w:sz w:val="28"/>
+          <w:szCs w:val="48"/>
+        </w:rPr>
+        <w:t>virtualTri</w:t>
+      </w:r>
+      <w:proofErr w:type="spellEnd"/>
+      <w:r>
+        <w:rPr>
+          <w:sz w:val="28"/>
+          <w:szCs w:val="48"/>
+        </w:rPr>
+        <w:t xml:space="preserve"> instead.  You’ll see in the skeleton code how this works.</w:t>
+      </w:r>
+      <w:r>
+        <w:rPr>
+          <w:sz w:val="28"/>
+          <w:szCs w:val="48"/>
+        </w:rPr>
+        <w:br w:type="page"/>
+      </w:r>
+    </w:p>
+    <w:p>
+      <w:pPr>
+        <w:jc w:val="center"/>
+        <w:rPr>
+          <w:sz w:val="28"/>
+          <w:szCs w:val="48"/>
+        </w:rPr>
+      </w:pPr>
+      <w:r>
+        <w:rPr>
+          <w:b/>
+          <w:sz w:val="40"/>
+          <w:szCs w:val="48"/>
+        </w:rPr>
+        <w:lastRenderedPageBreak/>
+        <w:t>Assignment 06</w:t>
+      </w:r>
+      <w:r>
+        <w:rPr>
+          <w:b/>
+          <w:sz w:val="40"/>
+          <w:szCs w:val="48"/>
+        </w:rPr>
+        <w:t>rainbow!</w:t>
+      </w:r>
+    </w:p>
+    <w:p>
+      <w:pPr>
+        <w:rPr>
+          <w:sz w:val="28"/>
+          <w:szCs w:val="48"/>
+        </w:rPr>
+      </w:pPr>
+      <w:r>
+        <w:rPr>
+          <w:noProof/>
+        </w:rPr>
+        <mc:AlternateContent>
+          <mc:Choice Requires="wps">
+            <w:drawing>
+              <wp:anchor distT="0" distB="0" distL="114300" distR="114300" simplePos="0" relativeHeight="251660288" behindDoc="0" locked="0" layoutInCell="1" allowOverlap="1" wp14:anchorId="0C521C2B" wp14:editId="450F616E">
+                <wp:simplePos x="0" y="0"/>
+                <wp:positionH relativeFrom="column">
+                  <wp:posOffset>3390900</wp:posOffset>
+                </wp:positionH>
+                <wp:positionV relativeFrom="paragraph">
+                  <wp:posOffset>3183255</wp:posOffset>
+                </wp:positionV>
+                <wp:extent cx="2381250" cy="635"/>
+                <wp:effectExtent l="0" t="0" r="0" b="18415"/>
+                <wp:wrapSquare wrapText="bothSides"/>
+                <wp:docPr id="2" name="Text Box 2"/>
+                <wp:cNvGraphicFramePr/>
+                <a:graphic xmlns:a="http://schemas.openxmlformats.org/drawingml/2006/main">
+                  <a:graphicData uri="http://schemas.microsoft.com/office/word/2010/wordprocessingShape">
+                    <wps:wsp>
+                      <wps:cNvSpPr txBox="1"/>
+                      <wps:spPr>
+                        <a:xfrm>
+                          <a:off x="0" y="0"/>
+                          <a:ext cx="2381250" cy="635"/>
+                        </a:xfrm>
+                        <a:prstGeom prst="rect">
+                          <a:avLst/>
+                        </a:prstGeom>
+                        <a:solidFill>
+                          <a:prstClr val="white"/>
+                        </a:solidFill>
+                        <a:ln>
+                          <a:noFill/>
+                        </a:ln>
+                      </wps:spPr>
+                      <wps:txbx>
+                        <w:txbxContent>
+                          <w:p>
+                            <w:pPr>
+                              <w:pStyle w:val="Caption"/>
+                              <w:rPr>
+                                <w:noProof/>
+                              </w:rPr>
+                            </w:pPr>
+                            <w:r>
+                              <w:t>color spectrum for RGB.  Source- wikipedia.org RGB color model</w:t>
+                            </w:r>
+                          </w:p>
+                        </w:txbxContent>
+                      </wps:txbx>
+                      <wps:bodyPr rot="0" spcFirstLastPara="0" vertOverflow="overflow" horzOverflow="overflow" vert="horz" wrap="square" lIns="0" tIns="0" rIns="0" bIns="0" numCol="1" spcCol="0" rtlCol="0" fromWordArt="0" anchor="t" anchorCtr="0" forceAA="0" compatLnSpc="1">
+                        <a:prstTxWarp prst="textNoShape">
+                          <a:avLst/>
+                        </a:prstTxWarp>
+                        <a:spAutoFit/>
+                      </wps:bodyPr>
+                    </wps:wsp>
+                  </a:graphicData>
+                </a:graphic>
+              </wp:anchor>
+            </w:drawing>
+          </mc:Choice>
+          <mc:Fallback>
+            <w:pict>
+              <v:shapetype w14:anchorId="0C521C2B" id="_x0000_t202" coordsize="21600,21600" o:spt="202" path="m,l,21600r21600,l21600,xe">
+                <v:stroke joinstyle="miter"/>
+                <v:path gradientshapeok="t" o:connecttype="rect"/>
+              </v:shapetype>
+              <v:shape id="Text Box 2" o:spid="_x0000_s1026" type="#_x0000_t202" style="position:absolute;margin-left:267pt;margin-top:250.65pt;width:187.5pt;height:.05pt;z-index:251660288;visibility:visible;mso-wrap-style:square;mso-wrap-distance-left:9pt;mso-wrap-distance-top:0;mso-wrap-distance-right:9pt;mso-wrap-distance-bottom:0;mso-position-horizontal:absolute;mso-position-horizontal-relative:text;mso-position-vertical:absolute;mso-position-vertical-relative:text;v-text-anchor:top" o:gfxdata="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" stroked="f">
+                <v:textbox style="mso-fit-shape-to-text:t" inset="0,0,0,0">
+                  <w:txbxContent>
+                    <w:p>
+                      <w:pPr>
+                        <w:pStyle w:val="Caption"/>
+                        <w:rPr>
+                          <w:noProof/>
+                        </w:rPr>
+                      </w:pPr>
+                      <w:r>
+                        <w:t>color spectrum for RGB.  Source- wikipedia.org RGB color model</w:t>
+                      </w:r>
+                    </w:p>
+                  </w:txbxContent>
+                </v:textbox>
+                <w10:wrap type="square"/>
+              </v:shape>
+            </w:pict>
+          </mc:Fallback>
+        </mc:AlternateContent>
+      </w:r>
+      <w:r>
+        <w:rPr>
+          <w:noProof/>
+        </w:rPr>
+        <w:drawing>
+          <wp:anchor distT="0" distB="0" distL="114300" distR="114300" simplePos="0" relativeHeight="251658240" behindDoc="0" locked="0" layoutInCell="1" allowOverlap="1" wp14:anchorId="296BBB02" wp14:editId="24F208FB">
+            <wp:simplePos x="0" y="0"/>
+            <wp:positionH relativeFrom="column">
+              <wp:posOffset>3390900</wp:posOffset>
+            </wp:positionH>
+            <wp:positionV relativeFrom="paragraph">
+              <wp:posOffset>744855</wp:posOffset>
+            </wp:positionV>
+            <wp:extent cx="2381250" cy="2381250"/>
+            <wp:effectExtent l="0" t="0" r="0" b="0"/>
+            <wp:wrapSquare wrapText="bothSides"/>
+            <wp:docPr id="1" name="Picture 1" descr="https://upload.wikimedia.org/wikipedia/commons/thumb/c/c5/RGB_color_wheel_10.svg/250px-RGB_color_wheel_10.svg.png"/>
+            <wp:cNvGraphicFramePr>
+              <a:graphicFrameLocks xmlns:a="http://schemas.openxmlformats.org/drawingml/2006/main" noChangeAspect="1"/>
+            </wp:cNvGraphicFramePr>
+            <a:graphic xmlns:a="http://schemas.openxmlformats.org/drawingml/2006/main">
+              <a:graphicData uri="http://schemas.openxmlformats.org/drawingml/2006/picture">
+                <pic:pic xmlns:pic="http://schemas.openxmlformats.org/drawingml/2006/picture">
+                  <pic:nvPicPr>
+                    <pic:cNvPr id="0" name="Picture 1" descr="https://upload.wikimedia.org/wikipedia/commons/thumb/c/c5/RGB_color_wheel_10.svg/250px-RGB_color_wheel_10.svg.png"/>
+                    <pic:cNvPicPr>
+                      <a:picLocks noChangeAspect="1" noChangeArrowheads="1"/>
+                    </pic:cNvPicPr>
+                  </pic:nvPicPr>
+                  <pic:blipFill>
+                    <a:blip r:embed="rId4">
+                      <a:extLst>
+                        <a:ext uri="{28A0092B-C50C-407E-A947-70E740481C1C}">
+                          <a14:useLocalDpi xmlns:a14="http://schemas.microsoft.com/office/drawing/2010/main" val="0"/>
+                        </a:ext>
+                      </a:extLst>
+                    </a:blip>
+                    <a:srcRect/>
+                    <a:stretch>
+                      <a:fillRect/>
+                    </a:stretch>
+                  </pic:blipFill>
+                  <pic:spPr bwMode="auto">
+                    <a:xfrm>
+                      <a:off x="0" y="0"/>
+                      <a:ext cx="2381250" cy="2381250"/>
+                    </a:xfrm>
+                    <a:prstGeom prst="rect">
+                      <a:avLst/>
+                    </a:prstGeom>
+                    <a:noFill/>
+                    <a:ln>
+                      <a:noFill/>
+                    </a:ln>
+                  </pic:spPr>
+                </pic:pic>
+              </a:graphicData>
+            </a:graphic>
+          </wp:anchor>
+        </w:drawing>
+      </w:r>
+      <w:r>
+        <w:rPr>
+          <w:sz w:val="28"/>
+          <w:szCs w:val="48"/>
+        </w:rPr>
+        <w:tab/>
+      </w:r>
+      <w:r>
+        <w:rPr>
+          <w:sz w:val="28"/>
+          <w:szCs w:val="48"/>
+        </w:rPr>
+        <w:t xml:space="preserve">Ordinarily, before attempting rainbow! We would do the next assignment combo, but combo is more difficult and I like rainbow better anyways.  In this </w:t>
+      </w:r>
+      <w:r>
+        <w:rPr>
+          <w:sz w:val="28"/>
+          <w:szCs w:val="48"/>
+        </w:rPr>
+        <w:t xml:space="preserve">assignment, we need to create a function that transitions seamlessly through the different potential values of our pins.  For </w:t>
+      </w:r>
+      <w:proofErr w:type="gramStart"/>
+      <w:r>
+        <w:rPr>
+          <w:sz w:val="28"/>
+          <w:szCs w:val="48"/>
+        </w:rPr>
+        <w:t>example</w:t>
+      </w:r>
+      <w:proofErr w:type="gramEnd"/>
+      <w:r>
+        <w:rPr>
+          <w:sz w:val="28"/>
+          <w:szCs w:val="48"/>
+        </w:rPr>
+        <w:t xml:space="preserve"> see this graph that I stole- I mean- properly sourced- from Wikipedia! </w:t>
+      </w:r>
+    </w:p>
+    <w:p>
+      <w:pPr>
+        <w:rPr>
+          <w:sz w:val="28"/>
+          <w:szCs w:val="48"/>
+        </w:rPr>
+      </w:pPr>
+      <w:r>
+        <w:rPr>
+          <w:sz w:val="28"/>
+          <w:szCs w:val="48"/>
+        </w:rPr>
+        <w:tab/>
+        <w:t xml:space="preserve">So that’s what we want to make!  In order to do this, we need to increase red green and blue at different times!  There are many different ways to accomplish this; however, I would like you to do it by creating a system that imitates the following chart when prompted.  So all colors begin off, and then red rises to a peak.  As red falls, green rises until it peaks and then </w:t>
+      </w:r>
+      <w:r>
+        <w:rPr>
+          <w:sz w:val="28"/>
+          <w:szCs w:val="48"/>
+        </w:rPr>
+        <w:t>the same happens to green blue.</w:t>
+      </w:r>
       <w:bookmarkStart w:id="0" w:name="_GoBack"/>
       <w:bookmarkEnd w:id="0"/>
-      <w:r>
-        <w:rPr>
-          <w:b/>
-          <w:sz w:val="40"/>
-          <w:szCs w:val="48"/>
-        </w:rPr>
-        <w:t xml:space="preserve"> </w:t>
-      </w:r>
-      <w:proofErr w:type="spellStart"/>
-      <w:r>
-        <w:rPr>
-          <w:b/>
-          <w:sz w:val="40"/>
-          <w:szCs w:val="48"/>
-        </w:rPr>
-        <w:t>TriColor</w:t>
-      </w:r>
-      <w:proofErr w:type="spellEnd"/>
-      <w:r>
-        <w:rPr>
-          <w:b/>
-          <w:sz w:val="40"/>
-          <w:szCs w:val="48"/>
-        </w:rPr>
-        <w:t xml:space="preserve"> Control</w:t>
-      </w:r>
-    </w:p>
-    <w:p>
-      <w:pPr>
-        <w:rPr>
-          <w:sz w:val="28"/>
-          <w:szCs w:val="48"/>
-        </w:rPr>
-      </w:pPr>
-      <w:r>
-        <w:rPr>
-          <w:sz w:val="28"/>
-          <w:szCs w:val="48"/>
-        </w:rPr>
-        <w:tab/>
-        <w:t>Okay, that la</w:t>
-      </w:r>
-      <w:r>
-        <w:rPr>
-          <w:sz w:val="28"/>
-          <w:szCs w:val="48"/>
-        </w:rPr>
-        <w:t>st assignment was about as gross</w:t>
-      </w:r>
-      <w:r>
-        <w:rPr>
-          <w:sz w:val="28"/>
-          <w:szCs w:val="48"/>
-        </w:rPr>
-        <w:t xml:space="preserve"> as they get.  This next one is much </w:t>
-      </w:r>
-      <w:proofErr w:type="spellStart"/>
-      <w:r>
-        <w:rPr>
-          <w:sz w:val="28"/>
-          <w:szCs w:val="48"/>
-        </w:rPr>
-        <w:t>much</w:t>
-      </w:r>
-      <w:proofErr w:type="spellEnd"/>
-      <w:r>
-        <w:rPr>
-          <w:sz w:val="28"/>
-          <w:szCs w:val="48"/>
-        </w:rPr>
-        <w:t xml:space="preserve"> simpler.  It still has the nasty class at the top because we need a virtual class to practice on, but this code </w:t>
-      </w:r>
-      <w:r>
-        <w:rPr>
-          <w:sz w:val="28"/>
-          <w:szCs w:val="48"/>
-        </w:rPr>
-        <w:t>will read more smoothly hopefully</w:t>
-      </w:r>
-    </w:p>
-    <w:p>
-      <w:pPr>
-        <w:rPr>
-          <w:sz w:val="28"/>
-          <w:szCs w:val="48"/>
-        </w:rPr>
-      </w:pPr>
-      <w:r>
-        <w:rPr>
-          <w:sz w:val="28"/>
-          <w:szCs w:val="48"/>
-        </w:rPr>
-        <w:tab/>
-        <w:t>So the main goal of this code, is to activate a Tricolor Led, which has three different LEDs inside of it.  So the big difference (which isn’t really much of a difference) is controlling all those different colors at once.</w:t>
-      </w:r>
-    </w:p>
-    <w:p>
-      <w:pPr>
-        <w:rPr>
-          <w:sz w:val="28"/>
-          <w:szCs w:val="48"/>
-        </w:rPr>
-      </w:pPr>
-      <w:r>
-        <w:rPr>
-          <w:sz w:val="28"/>
-          <w:szCs w:val="48"/>
-        </w:rPr>
-        <w:tab/>
-        <w:t xml:space="preserve">Objectives are the LED must initially turn on with only one color.  If a button is pressed (interpreted as a 1 input on the keyboard) it should cycle to a different color, and if you type a specific color it should turn the rest </w:t>
-      </w:r>
-      <w:proofErr w:type="spellStart"/>
-      <w:r>
-        <w:rPr>
-          <w:sz w:val="28"/>
-          <w:szCs w:val="48"/>
-        </w:rPr>
-        <w:t>off</w:t>
-      </w:r>
-      <w:proofErr w:type="spellEnd"/>
-      <w:r>
-        <w:rPr>
-          <w:sz w:val="28"/>
-          <w:szCs w:val="48"/>
-        </w:rPr>
-        <w:t xml:space="preserve"> and that one on</w:t>
-      </w:r>
-      <w:r>
-        <w:rPr>
-          <w:sz w:val="28"/>
-          <w:szCs w:val="48"/>
-        </w:rPr>
-        <w:t xml:space="preserve"> at duty cycle 75</w:t>
-      </w:r>
-      <w:r>
-        <w:rPr>
-          <w:sz w:val="28"/>
-          <w:szCs w:val="48"/>
-        </w:rPr>
-        <w:t xml:space="preserve">, and if you type a </w:t>
-      </w:r>
-      <w:proofErr w:type="gramStart"/>
-      <w:r>
-        <w:rPr>
-          <w:sz w:val="28"/>
-          <w:szCs w:val="48"/>
-        </w:rPr>
-        <w:t xml:space="preserve">9 </w:t>
-      </w:r>
-      <w:r>
-        <w:rPr>
-          <w:sz w:val="28"/>
-          <w:szCs w:val="48"/>
-        </w:rPr>
-        <w:t>digit</w:t>
-      </w:r>
-      <w:proofErr w:type="gramEnd"/>
-      <w:r>
-        <w:rPr>
-          <w:sz w:val="28"/>
-          <w:szCs w:val="48"/>
-        </w:rPr>
-        <w:t xml:space="preserve"> color code it shou</w:t>
-      </w:r>
-      <w:r>
-        <w:rPr>
-          <w:sz w:val="28"/>
-          <w:szCs w:val="48"/>
-        </w:rPr>
-        <w:t>ld make that exact color (</w:t>
-      </w:r>
-      <w:proofErr w:type="spellStart"/>
-      <w:r>
-        <w:rPr>
-          <w:sz w:val="28"/>
-          <w:szCs w:val="48"/>
-        </w:rPr>
-        <w:t>redgreenblue</w:t>
-      </w:r>
-      <w:proofErr w:type="spellEnd"/>
-      <w:r>
-        <w:rPr>
-          <w:sz w:val="28"/>
-          <w:szCs w:val="48"/>
-        </w:rPr>
-        <w:t>)</w:t>
-      </w:r>
-      <w:r>
-        <w:rPr>
-          <w:sz w:val="28"/>
-          <w:szCs w:val="48"/>
-        </w:rPr>
-        <w:t>.  For example: 100000050 would set red to 100, and green to 000 and blue to 100.</w:t>
-      </w:r>
-    </w:p>
-    <w:p>
-      <w:pPr>
-        <w:rPr>
-          <w:sz w:val="28"/>
-          <w:szCs w:val="48"/>
-        </w:rPr>
-      </w:pPr>
-      <w:r>
-        <w:rPr>
-          <w:sz w:val="28"/>
-          <w:szCs w:val="48"/>
-        </w:rPr>
-        <w:tab/>
-        <w:t>There is a skeleton again, and an expected output that prints what the interaction between the program and the user should look like.</w:t>
-      </w:r>
-      <w:r>
-        <w:rPr>
-          <w:sz w:val="28"/>
-          <w:szCs w:val="48"/>
-        </w:rPr>
-        <w:br w:type="page"/>
-      </w:r>
-    </w:p>
-    <w:p>
-      <w:pPr>
-        <w:jc w:val="center"/>
-        <w:rPr>
-          <w:sz w:val="28"/>
-          <w:szCs w:val="48"/>
-        </w:rPr>
-      </w:pPr>
-      <w:r>
-        <w:rPr>
-          <w:b/>
-          <w:sz w:val="40"/>
-          <w:szCs w:val="48"/>
-        </w:rPr>
-        <w:lastRenderedPageBreak/>
-        <w:t>Assignment 03. Rainbow!</w:t>
-      </w:r>
-    </w:p>
-    <w:p>
-      <w:pPr>
-        <w:rPr>
-          <w:sz w:val="28"/>
-          <w:szCs w:val="48"/>
-        </w:rPr>
-      </w:pPr>
-      <w:r>
-        <w:rPr>
-          <w:sz w:val="28"/>
-          <w:szCs w:val="48"/>
-        </w:rPr>
-        <w:tab/>
-        <w:t xml:space="preserve">I think that putting exclamation signs into filenames is bad juju, but we’ll see how this works out.  Anyways, the goal of this one is to make your tricolor LED slowly pulse in a rainbow!  This happens when each color reaches a peak, one at a time, and at least two colors are on all the time.  It’s also </w:t>
-      </w:r>
-      <w:proofErr w:type="spellStart"/>
-      <w:r>
-        <w:rPr>
-          <w:sz w:val="28"/>
-          <w:szCs w:val="48"/>
-        </w:rPr>
-        <w:t>kinda</w:t>
-      </w:r>
-      <w:proofErr w:type="spellEnd"/>
-      <w:r>
-        <w:rPr>
-          <w:sz w:val="28"/>
-          <w:szCs w:val="48"/>
-        </w:rPr>
-        <w:t xml:space="preserve"> pretty which is why I like it.</w:t>
-      </w:r>
-    </w:p>
-    <w:p>
-      <w:pPr>
-        <w:rPr>
-          <w:sz w:val="28"/>
-          <w:szCs w:val="48"/>
-        </w:rPr>
-      </w:pPr>
-      <w:r>
-        <w:rPr>
-          <w:sz w:val="28"/>
-          <w:szCs w:val="48"/>
-        </w:rPr>
-        <w:tab/>
-        <w:t>So the objective is to write a code that increases one color’s duty cycle to 100 and the decreases it again afterwards to zero, but while decreasing, another color should be increasing.  This just keeps looping, and if you did everything right you should get the same output as before</w:t>
-      </w:r>
-    </w:p>
-    <w:p>
-      <w:pPr>
-        <w:ind w:firstLine="720"/>
-        <w:rPr>
-          <w:sz w:val="28"/>
-          <w:szCs w:val="48"/>
-        </w:rPr>
-      </w:pPr>
-      <w:r>
-        <w:rPr>
-          <w:sz w:val="28"/>
-          <w:szCs w:val="48"/>
-        </w:rPr>
-        <w:tab/>
-        <w:t>There is a skeleton again, and an expected output that prints what the interaction between the program and the user should look like.</w:t>
-      </w:r>
     </w:p>
     <w:sectPr>
       <w:pgSz w:w="12240" w:h="15840"/>
@@ -2838,6 +2982,25 @@
     <w:semiHidden/>
     <w:unhideWhenUsed/>
   </w:style>
+  <w:style w:type="paragraph" w:styleId="Caption">
+    <w:name w:val="caption"/>
+    <w:basedOn w:val="Normal"/>
+    <w:next w:val="Normal"/>
+    <w:uiPriority w:val="35"/>
+    <w:unhideWhenUsed/>
+    <w:qFormat/>
+    <w:rsid w:val="008F10CC"/>
+    <w:pPr>
+      <w:spacing w:after="200" w:line="240" w:lineRule="auto"/>
+    </w:pPr>
+    <w:rPr>
+      <w:i/>
+      <w:iCs/>
+      <w:color w:val="44546A" w:themeColor="text2"/>
+      <w:sz w:val="18"/>
+      <w:szCs w:val="18"/>
+    </w:rPr>
+  </w:style>
 </w:styles>
 </file>
 

</xml_diff>

<commit_message>
updated based on student suggestions
</commit_message>
<xml_diff>
--- a/Python/Python_Assignments.docx
+++ b/Python/Python_Assignments.docx
@@ -1866,10 +1866,15 @@
           <w:sz w:val="28"/>
           <w:szCs w:val="48"/>
         </w:rPr>
-        <w:t xml:space="preserve">Code to remember: </w:t>
-      </w:r>
-      <w:bookmarkStart w:id="0" w:name="_GoBack"/>
-      <w:bookmarkEnd w:id="0"/>
+        <w:t xml:space="preserve">Things to </w:t>
+      </w:r>
+      <w:r>
+        <w:rPr>
+          <w:sz w:val="28"/>
+          <w:szCs w:val="48"/>
+        </w:rPr>
+        <w:t xml:space="preserve">remember: </w:t>
+      </w:r>
     </w:p>
     <w:p>
       <w:pPr>
@@ -1893,20 +1898,48 @@
     </w:p>
     <w:p>
       <w:pPr>
+        <w:pStyle w:val="ListParagraph"/>
+        <w:numPr>
+          <w:ilvl w:val="0"/>
+          <w:numId w:val="1"/>
+        </w:numPr>
+        <w:rPr>
+          <w:sz w:val="28"/>
+          <w:szCs w:val="48"/>
+        </w:rPr>
+      </w:pPr>
+      <w:r>
+        <w:rPr>
+          <w:sz w:val="28"/>
+          <w:szCs w:val="48"/>
+        </w:rPr>
+        <w:t>look up the range function if you’re not sure what it does (pay attention to the step variable)</w:t>
+      </w:r>
+    </w:p>
+    <w:p>
+      <w:pPr>
         <w:rPr>
           <w:b/>
           <w:sz w:val="40"/>
           <w:szCs w:val="48"/>
         </w:rPr>
       </w:pPr>
-    </w:p>
-    <w:p>
-      <w:pPr>
+      <w:r>
         <w:rPr>
           <w:b/>
           <w:sz w:val="40"/>
           <w:szCs w:val="48"/>
         </w:rPr>
+        <w:br w:type="page"/>
+      </w:r>
+    </w:p>
+    <w:p>
+      <w:pPr>
+        <w:jc w:val="center"/>
+        <w:rPr>
+          <w:sz w:val="28"/>
+          <w:szCs w:val="48"/>
+        </w:rPr>
       </w:pPr>
       <w:r>
         <w:rPr>
@@ -1914,25 +1947,16 @@
           <w:sz w:val="40"/>
           <w:szCs w:val="48"/>
         </w:rPr>
-        <w:br w:type="page"/>
-      </w:r>
-    </w:p>
-    <w:p>
-      <w:pPr>
-        <w:jc w:val="center"/>
-        <w:rPr>
-          <w:sz w:val="28"/>
-          <w:szCs w:val="48"/>
-        </w:rPr>
-      </w:pPr>
+        <w:lastRenderedPageBreak/>
+        <w:t>Assignment</w:t>
+      </w:r>
       <w:r>
         <w:rPr>
           <w:b/>
           <w:sz w:val="40"/>
           <w:szCs w:val="48"/>
         </w:rPr>
-        <w:lastRenderedPageBreak/>
-        <w:t>Assignment</w:t>
+        <w:t xml:space="preserve"> 0</w:t>
       </w:r>
       <w:r>
         <w:rPr>
@@ -1940,7 +1964,7 @@
           <w:sz w:val="40"/>
           <w:szCs w:val="48"/>
         </w:rPr>
-        <w:t xml:space="preserve"> 0</w:t>
+        <w:t>3</w:t>
       </w:r>
       <w:r>
         <w:rPr>
@@ -1948,7 +1972,7 @@
           <w:sz w:val="40"/>
           <w:szCs w:val="48"/>
         </w:rPr>
-        <w:t>3</w:t>
+        <w:t>p</w:t>
       </w:r>
       <w:r>
         <w:rPr>
@@ -1956,7 +1980,89 @@
           <w:sz w:val="40"/>
           <w:szCs w:val="48"/>
         </w:rPr>
-        <w:t>p</w:t>
+        <w:t>ulse</w:t>
+      </w:r>
+    </w:p>
+    <w:p>
+      <w:pPr>
+        <w:rPr>
+          <w:sz w:val="28"/>
+          <w:szCs w:val="48"/>
+        </w:rPr>
+      </w:pPr>
+      <w:r>
+        <w:rPr>
+          <w:sz w:val="28"/>
+          <w:szCs w:val="48"/>
+        </w:rPr>
+        <w:tab/>
+      </w:r>
+      <w:r>
+        <w:rPr>
+          <w:sz w:val="28"/>
+          <w:szCs w:val="48"/>
+        </w:rPr>
+        <w:t>At this point, you’ve gone over analyzing input and controlling the PWM leds, so let’s go ahead and write one more function, pulse, before combining them.  Pulse will continuously brighten and dim the LED, so the only input from the user should be the command pulse, and then your program should be fine to run.</w:t>
+      </w:r>
+    </w:p>
+    <w:p>
+      <w:pPr>
+        <w:ind w:firstLine="720"/>
+        <w:rPr>
+          <w:sz w:val="28"/>
+          <w:szCs w:val="48"/>
+        </w:rPr>
+      </w:pPr>
+      <w:r>
+        <w:rPr>
+          <w:sz w:val="28"/>
+          <w:szCs w:val="48"/>
+        </w:rPr>
+        <w:t>You should know everything that you need to for this assignment from the previous, assignments, so feel free to reference them as you make this one.  The skeleton for this code (very skimpy this tim</w:t>
+      </w:r>
+      <w:r>
+        <w:rPr>
+          <w:sz w:val="28"/>
+          <w:szCs w:val="48"/>
+        </w:rPr>
+        <w:t>e) is 03p</w:t>
+      </w:r>
+      <w:r>
+        <w:rPr>
+          <w:sz w:val="28"/>
+          <w:szCs w:val="48"/>
+        </w:rPr>
+        <w:t xml:space="preserve">ulse.py.  Like the last assignment it relies on the code in the </w:t>
+      </w:r>
+      <w:r>
+        <w:rPr>
+          <w:sz w:val="28"/>
+          <w:szCs w:val="48"/>
+        </w:rPr>
+        <w:t>python file virtual to imitate a PWM, so you’ll need the virtual.py in the same folder when it is run.</w:t>
+      </w:r>
+      <w:r>
+        <w:rPr>
+          <w:sz w:val="28"/>
+          <w:szCs w:val="48"/>
+        </w:rPr>
+        <w:t xml:space="preserve">  The expected output is put in a word doc as per usual, and DON’T FORGET THAT CTRL-C (or cmd-c on macs) IS USED TO BREAK LOOPS IN PYTHON!!!!</w:t>
+      </w:r>
+    </w:p>
+    <w:p>
+      <w:pPr>
+        <w:jc w:val="center"/>
+        <w:rPr>
+          <w:sz w:val="28"/>
+          <w:szCs w:val="48"/>
+        </w:rPr>
+      </w:pPr>
+      <w:r>
+        <w:rPr>
+          <w:sz w:val="28"/>
+          <w:szCs w:val="48"/>
+        </w:rPr>
+        <w:br w:type="page"/>
       </w:r>
       <w:r>
         <w:rPr>
@@ -1964,96 +2070,6 @@
           <w:sz w:val="40"/>
           <w:szCs w:val="48"/>
         </w:rPr>
-        <w:t>ulse</w:t>
-      </w:r>
-    </w:p>
-    <w:p>
-      <w:pPr>
-        <w:rPr>
-          <w:sz w:val="28"/>
-          <w:szCs w:val="48"/>
-        </w:rPr>
-      </w:pPr>
-      <w:r>
-        <w:rPr>
-          <w:sz w:val="28"/>
-          <w:szCs w:val="48"/>
-        </w:rPr>
-        <w:tab/>
-      </w:r>
-      <w:r>
-        <w:rPr>
-          <w:sz w:val="28"/>
-          <w:szCs w:val="48"/>
-        </w:rPr>
-        <w:t>At this point, you’ve gone over analyzing input and controlling the PWM leds, so let’s go ahead and write one more function, pulse, before combining them.  Pulse will continuously brighten and dim the LED, so the only input from the user should be the command pulse, and then your program should be fine to run.</w:t>
-      </w:r>
-    </w:p>
-    <w:p>
-      <w:pPr>
-        <w:ind w:firstLine="720"/>
-        <w:rPr>
-          <w:sz w:val="28"/>
-          <w:szCs w:val="48"/>
-        </w:rPr>
-      </w:pPr>
-      <w:r>
-        <w:rPr>
-          <w:sz w:val="28"/>
-          <w:szCs w:val="48"/>
-        </w:rPr>
-        <w:t>You should know everything that you need to for this assignment from the previous, assignments, so feel free to reference them as you make this one.  The skeleton for this code (very skimpy this tim</w:t>
-      </w:r>
-      <w:r>
-        <w:rPr>
-          <w:sz w:val="28"/>
-          <w:szCs w:val="48"/>
-        </w:rPr>
-        <w:t>e) is 03p</w:t>
-      </w:r>
-      <w:r>
-        <w:rPr>
-          <w:sz w:val="28"/>
-          <w:szCs w:val="48"/>
-        </w:rPr>
-        <w:t xml:space="preserve">ulse.py.  Like the last assignment it relies on the code in the </w:t>
-      </w:r>
-      <w:r>
-        <w:rPr>
-          <w:sz w:val="28"/>
-          <w:szCs w:val="48"/>
-        </w:rPr>
-        <w:t>python file virtual to imitate a PWM, so you’ll need the virtual.py in the same folder when it is run.</w:t>
-      </w:r>
-      <w:r>
-        <w:rPr>
-          <w:sz w:val="28"/>
-          <w:szCs w:val="48"/>
-        </w:rPr>
-        <w:t xml:space="preserve">  The expected output is put in a word doc as per usual, and DON’T FORGET THAT CTRL-C (or cmd-c on macs) IS USED TO BREAK LOOPS IN PYTHON!!!!</w:t>
-      </w:r>
-    </w:p>
-    <w:p>
-      <w:pPr>
-        <w:jc w:val="center"/>
-        <w:rPr>
-          <w:sz w:val="28"/>
-          <w:szCs w:val="48"/>
-        </w:rPr>
-      </w:pPr>
-      <w:r>
-        <w:rPr>
-          <w:sz w:val="28"/>
-          <w:szCs w:val="48"/>
-        </w:rPr>
-        <w:br w:type="page"/>
-      </w:r>
-      <w:r>
-        <w:rPr>
-          <w:b/>
-          <w:sz w:val="40"/>
-          <w:szCs w:val="48"/>
-        </w:rPr>
         <w:lastRenderedPageBreak/>
         <w:t>Assignment 04LED</w:t>
       </w:r>
@@ -2085,7 +2101,14 @@
           <w:sz w:val="28"/>
           <w:szCs w:val="48"/>
         </w:rPr>
-        <w:t>ly change it’s duty cycle, and can blink and fade and</w:t>
+        <w:t>ly change it</w:t>
+      </w:r>
+      <w:r>
+        <w:rPr>
+          <w:sz w:val="28"/>
+          <w:szCs w:val="48"/>
+        </w:rPr>
+        <w:t>s duty cycle, and can blink and fade and</w:t>
       </w:r>
       <w:r>
         <w:rPr>
@@ -2108,7 +2131,28 @@
           <w:sz w:val="28"/>
           <w:szCs w:val="48"/>
         </w:rPr>
-        <w:t>So I’ve included the example already written into the assignment, and you guys should be able to write the rest on your own because you’re all pretty dang smart (sorry but we have high expectations once you make it to college).  Still if you have any questions, feel free to ask Dr. Jasper or myself for help!</w:t>
+        <w:t xml:space="preserve">So I’ve included blink </w:t>
+      </w:r>
+      <w:r>
+        <w:rPr>
+          <w:sz w:val="28"/>
+          <w:szCs w:val="48"/>
+        </w:rPr>
+        <w:t>already written into the assignment</w:t>
+      </w:r>
+      <w:r>
+        <w:rPr>
+          <w:sz w:val="28"/>
+          <w:szCs w:val="48"/>
+        </w:rPr>
+        <w:t xml:space="preserve"> (completely finished!)</w:t>
+      </w:r>
+      <w:r>
+        <w:rPr>
+          <w:sz w:val="28"/>
+          <w:szCs w:val="48"/>
+        </w:rPr>
+        <w:t>, and you guys should be able to write the rest on your own because you’re all pretty dang smart (sorry but we have high expectations once you make it to college).  Still if you have any questions, feel free to ask Dr. Jasper or myself for help!</w:t>
       </w:r>
     </w:p>
     <w:p>
@@ -2141,6 +2185,31 @@
           <w:szCs w:val="48"/>
         </w:rPr>
         <w:t>and DON’T FORGET THAT CTRL-C (or cmd-c on macs) IS USED TO BREAK LOOPS IN PYTHON!!!!</w:t>
+      </w:r>
+    </w:p>
+    <w:p>
+      <w:pPr>
+        <w:ind w:firstLine="720"/>
+        <w:rPr>
+          <w:sz w:val="16"/>
+          <w:szCs w:val="48"/>
+        </w:rPr>
+      </w:pPr>
+      <w:r>
+        <w:rPr>
+          <w:sz w:val="28"/>
+          <w:szCs w:val="48"/>
+        </w:rPr>
+        <w:t>Tldr:  Blink is already written, take all your previous programs, write them into the program LED</w:t>
+      </w:r>
+      <w:bookmarkStart w:id="0" w:name="_GoBack"/>
+      <w:bookmarkEnd w:id="0"/>
+      <w:r>
+        <w:rPr>
+          <w:sz w:val="28"/>
+          <w:szCs w:val="48"/>
+        </w:rPr>
+        <w:t xml:space="preserve"> as functions, and get your program to run all of them at once.</w:t>
       </w:r>
       <w:r>
         <w:rPr>
@@ -4276,7 +4345,7 @@
 </file>
 
 <file path=customXml/itemProps1.xml><?xml version="1.0" encoding="utf-8"?>
-<ds:datastoreItem xmlns:ds="http://schemas.openxmlformats.org/officeDocument/2006/customXml" ds:itemID="{ACE27A99-1F2D-412F-B792-03C4BD69E457}">
+<ds:datastoreItem xmlns:ds="http://schemas.openxmlformats.org/officeDocument/2006/customXml" ds:itemID="{C75569E8-8A54-4704-8F9F-E5EDB076F93D}">
   <ds:schemaRefs>
     <ds:schemaRef ds:uri="http://schemas.openxmlformats.org/officeDocument/2006/bibliography"/>
   </ds:schemaRefs>

</xml_diff>